<commit_message>
Update recruitment application files
</commit_message>
<xml_diff>
--- a/downloads/資料5_募集要項（基礎コース）（案）修正案.docx
+++ b/downloads/資料5_募集要項（基礎コース）（案）修正案.docx
@@ -645,7 +645,6 @@
         </w:numPr>
         <w:ind w:leftChars="0"/>
         <w:rPr>
-          <w:del w:id="0" w:author="作成者"/>
           <w:rFonts w:ascii="游明朝" w:eastAsia="游明朝" w:hAnsi="游明朝"/>
           <w:b/>
           <w:szCs w:val="21"/>
@@ -662,96 +661,44 @@
     </w:p>
     <w:p>
       <w:pPr>
-        <w:pStyle w:val="a3"/>
-        <w:numPr>
-          <w:ilvl w:val="0"/>
-          <w:numId w:val="3"/>
-        </w:numPr>
-        <w:ind w:leftChars="0"/>
-        <w:rPr>
-          <w:ins w:id="1" w:author="作成者"/>
-          <w:rFonts w:ascii="游明朝" w:eastAsia="游明朝" w:hAnsi="游明朝"/>
-          <w:b/>
-          <w:szCs w:val="21"/>
-        </w:rPr>
-      </w:pPr>
-    </w:p>
-    <w:p>
-      <w:pPr>
         <w:ind w:firstLineChars="250" w:firstLine="525"/>
         <w:rPr>
           <w:rFonts w:ascii="游明朝" w:eastAsia="游明朝" w:hAnsi="游明朝"/>
           <w:szCs w:val="21"/>
-          <w:rPrChange w:id="2" w:author="作成者">
-            <w:rPr/>
-          </w:rPrChange>
-        </w:rPr>
-        <w:pPrChange w:id="3" w:author="作成者">
-          <w:pPr/>
-        </w:pPrChange>
-      </w:pPr>
-      <w:del w:id="4" w:author="作成者">
-        <w:r>
-          <w:rPr>
-            <w:rFonts w:ascii="游明朝" w:eastAsia="游明朝" w:hAnsi="游明朝" w:hint="eastAsia"/>
-            <w:szCs w:val="21"/>
-            <w:rPrChange w:id="5" w:author="作成者">
-              <w:rPr>
-                <w:rFonts w:hint="eastAsia"/>
-              </w:rPr>
-            </w:rPrChange>
-          </w:rPr>
-          <w:delText xml:space="preserve">　　</w:delText>
-        </w:r>
-      </w:del>
-      <w:ins w:id="6" w:author="作成者">
-        <w:r>
-          <w:rPr>
-            <w:rFonts w:ascii="游明朝" w:eastAsia="游明朝" w:hAnsi="游明朝" w:hint="eastAsia"/>
-            <w:szCs w:val="21"/>
-          </w:rPr>
-          <w:t>(</w:t>
-        </w:r>
-        <w:r>
-          <w:rPr>
-            <w:rFonts w:ascii="游明朝" w:eastAsia="游明朝" w:hAnsi="游明朝"/>
-            <w:szCs w:val="21"/>
-            <w:rPrChange w:id="7" w:author="作成者">
-              <w:rPr/>
-            </w:rPrChange>
-          </w:rPr>
-          <w:t>1</w:t>
-        </w:r>
-        <w:r>
-          <w:rPr>
-            <w:rFonts w:ascii="游明朝" w:eastAsia="游明朝" w:hAnsi="游明朝" w:hint="eastAsia"/>
-            <w:szCs w:val="21"/>
-            <w:rPrChange w:id="8" w:author="作成者">
-              <w:rPr>
-                <w:rFonts w:hint="eastAsia"/>
-              </w:rPr>
-            </w:rPrChange>
-          </w:rPr>
-          <w:t xml:space="preserve">）基礎コース　</w:t>
-        </w:r>
-      </w:ins>
-      <w:r>
-        <w:rPr>
-          <w:rFonts w:ascii="游明朝" w:eastAsia="游明朝" w:hAnsi="游明朝"/>
-          <w:szCs w:val="21"/>
-          <w:rPrChange w:id="9" w:author="作成者">
-            <w:rPr/>
-          </w:rPrChange>
+        </w:rPr>
+      </w:pPr>
+      <w:r>
+        <w:rPr>
+          <w:rFonts w:ascii="游明朝" w:eastAsia="游明朝" w:hAnsi="游明朝" w:hint="eastAsia"/>
+          <w:szCs w:val="21"/>
+        </w:rPr>
+        <w:t>(</w:t>
+      </w:r>
+      <w:r>
+        <w:rPr>
+          <w:rFonts w:ascii="游明朝" w:eastAsia="游明朝" w:hAnsi="游明朝"/>
+          <w:szCs w:val="21"/>
         </w:rPr>
         <w:t>1</w:t>
       </w:r>
       <w:r>
         <w:rPr>
-          <w:rFonts w:ascii="游明朝" w:eastAsia="游明朝" w:hAnsi="游明朝"/>
-          <w:szCs w:val="21"/>
-          <w:rPrChange w:id="10" w:author="作成者">
-            <w:rPr/>
-          </w:rPrChange>
+          <w:rFonts w:ascii="游明朝" w:eastAsia="游明朝" w:hAnsi="游明朝" w:hint="eastAsia"/>
+          <w:szCs w:val="21"/>
+        </w:rPr>
+        <w:t xml:space="preserve">）基礎コース　</w:t>
+      </w:r>
+      <w:r>
+        <w:rPr>
+          <w:rFonts w:ascii="游明朝" w:eastAsia="游明朝" w:hAnsi="游明朝"/>
+          <w:szCs w:val="21"/>
+        </w:rPr>
+        <w:t>1</w:t>
+      </w:r>
+      <w:r>
+        <w:rPr>
+          <w:rFonts w:ascii="游明朝" w:eastAsia="游明朝" w:hAnsi="游明朝"/>
+          <w:szCs w:val="21"/>
         </w:rPr>
         <w:t>8</w:t>
       </w:r>
@@ -759,11 +706,6 @@
         <w:rPr>
           <w:rFonts w:ascii="游明朝" w:eastAsia="游明朝" w:hAnsi="游明朝" w:hint="eastAsia"/>
           <w:szCs w:val="21"/>
-          <w:rPrChange w:id="11" w:author="作成者">
-            <w:rPr>
-              <w:rFonts w:hint="eastAsia"/>
-            </w:rPr>
-          </w:rPrChange>
         </w:rPr>
         <w:t>名</w:t>
       </w:r>
@@ -771,20 +713,17 @@
     <w:p>
       <w:pPr>
         <w:rPr>
-          <w:ins w:id="12" w:author="作成者"/>
-          <w:rFonts w:ascii="游明朝" w:eastAsia="游明朝" w:hAnsi="游明朝"/>
-          <w:szCs w:val="21"/>
-        </w:rPr>
-      </w:pPr>
-      <w:ins w:id="13" w:author="作成者">
-        <w:r>
-          <w:rPr>
-            <w:rFonts w:ascii="游明朝" w:eastAsia="游明朝" w:hAnsi="游明朝" w:hint="eastAsia"/>
-            <w:szCs w:val="21"/>
-          </w:rPr>
-          <w:t xml:space="preserve">　　（2）応用コース　17名</w:t>
-        </w:r>
-      </w:ins>
+          <w:rFonts w:ascii="游明朝" w:eastAsia="游明朝" w:hAnsi="游明朝"/>
+          <w:szCs w:val="21"/>
+        </w:rPr>
+      </w:pPr>
+      <w:r>
+        <w:rPr>
+          <w:rFonts w:ascii="游明朝" w:eastAsia="游明朝" w:hAnsi="游明朝" w:hint="eastAsia"/>
+          <w:szCs w:val="21"/>
+        </w:rPr>
+        <w:t xml:space="preserve">　　（2）応用コース　17名</w:t>
+      </w:r>
     </w:p>
     <w:p>
       <w:pPr>
@@ -833,7 +772,6 @@
         <w:ind w:leftChars="202" w:left="844" w:hangingChars="200" w:hanging="420"/>
         <w:jc w:val="left"/>
         <w:rPr>
-          <w:ins w:id="14" w:author="作成者"/>
           <w:rFonts w:ascii="游明朝" w:eastAsia="游明朝" w:hAnsi="游明朝"/>
           <w:szCs w:val="21"/>
         </w:rPr>
@@ -845,15 +783,13 @@
         </w:rPr>
         <w:t>（1）</w:t>
       </w:r>
-      <w:ins w:id="15" w:author="作成者">
-        <w:r>
-          <w:rPr>
-            <w:rFonts w:ascii="游明朝" w:eastAsia="游明朝" w:hAnsi="游明朝" w:hint="eastAsia"/>
-            <w:szCs w:val="21"/>
-          </w:rPr>
-          <w:t>基礎コース</w:t>
-        </w:r>
-      </w:ins>
+      <w:r>
+        <w:rPr>
+          <w:rFonts w:ascii="游明朝" w:eastAsia="游明朝" w:hAnsi="游明朝" w:hint="eastAsia"/>
+          <w:szCs w:val="21"/>
+        </w:rPr>
+        <w:t>基礎コース</w:t>
+      </w:r>
     </w:p>
     <w:p>
       <w:pPr>
@@ -863,12 +799,6 @@
           <w:rFonts w:ascii="游明朝" w:eastAsia="游明朝" w:hAnsi="游明朝"/>
           <w:szCs w:val="21"/>
         </w:rPr>
-        <w:pPrChange w:id="16" w:author="作成者">
-          <w:pPr>
-            <w:ind w:leftChars="202" w:left="844" w:hangingChars="200" w:hanging="420"/>
-            <w:jc w:val="left"/>
-          </w:pPr>
-        </w:pPrChange>
       </w:pPr>
       <w:r>
         <w:rPr>
@@ -986,7 +916,6 @@
     <w:p>
       <w:pPr>
         <w:rPr>
-          <w:ins w:id="17" w:author="作成者"/>
           <w:rFonts w:ascii="游明朝" w:eastAsia="游明朝" w:hAnsi="游明朝"/>
           <w:szCs w:val="21"/>
         </w:rPr>
@@ -998,15 +927,13 @@
         </w:rPr>
         <w:t xml:space="preserve">　　（2）</w:t>
       </w:r>
-      <w:ins w:id="18" w:author="作成者">
-        <w:r>
-          <w:rPr>
-            <w:rFonts w:ascii="游明朝" w:eastAsia="游明朝" w:hAnsi="游明朝" w:hint="eastAsia"/>
-            <w:szCs w:val="21"/>
-          </w:rPr>
-          <w:t>応用コース</w:t>
-        </w:r>
-      </w:ins>
+      <w:r>
+        <w:rPr>
+          <w:rFonts w:ascii="游明朝" w:eastAsia="游明朝" w:hAnsi="游明朝" w:hint="eastAsia"/>
+          <w:szCs w:val="21"/>
+        </w:rPr>
+        <w:t>応用コース</w:t>
+      </w:r>
     </w:p>
     <w:p>
       <w:pPr>
@@ -1015,9 +942,6 @@
           <w:rFonts w:ascii="游明朝" w:eastAsia="游明朝" w:hAnsi="游明朝"/>
           <w:szCs w:val="21"/>
         </w:rPr>
-        <w:pPrChange w:id="19" w:author="作成者">
-          <w:pPr/>
-        </w:pPrChange>
       </w:pPr>
       <w:r>
         <w:rPr>
@@ -1488,46 +1412,443 @@
         </w:rPr>
         <w:t>（1）</w:t>
       </w:r>
-      <w:ins w:id="20" w:author="作成者">
+      <w:r>
+        <w:rPr>
+          <w:rFonts w:ascii="游明朝" w:eastAsia="游明朝" w:hAnsi="游明朝" w:hint="eastAsia"/>
+          <w:bCs/>
+          <w:szCs w:val="21"/>
+        </w:rPr>
+        <w:t>基礎コース（</w:t>
+      </w:r>
+      <w:r>
+        <w:rPr>
+          <w:rFonts w:ascii="游明朝" w:eastAsia="游明朝" w:hAnsi="游明朝" w:hint="eastAsia"/>
+          <w:bCs/>
+          <w:szCs w:val="21"/>
+        </w:rPr>
+        <w:t>コンソーシアムに参画する大学</w:t>
+      </w:r>
+      <w:r>
+        <w:rPr>
+          <w:rFonts w:ascii="游明朝" w:eastAsia="游明朝" w:hAnsi="游明朝" w:hint="eastAsia"/>
+          <w:bCs/>
+          <w:szCs w:val="21"/>
+        </w:rPr>
+        <w:t>の修士1年生</w:t>
+      </w:r>
+      <w:r>
+        <w:rPr>
+          <w:rFonts w:ascii="游明朝" w:eastAsia="游明朝" w:hAnsi="游明朝" w:hint="eastAsia"/>
+          <w:bCs/>
+          <w:szCs w:val="21"/>
+        </w:rPr>
+        <w:t>）</w:t>
+      </w:r>
+    </w:p>
+    <w:p>
+      <w:pPr>
+        <w:ind w:leftChars="406" w:left="1134" w:hangingChars="134" w:hanging="281"/>
+        <w:jc w:val="left"/>
+        <w:rPr>
+          <w:rFonts w:ascii="游明朝" w:eastAsia="游明朝" w:hAnsi="游明朝"/>
+          <w:szCs w:val="21"/>
+        </w:rPr>
+      </w:pPr>
+      <w:r>
+        <w:rPr>
+          <w:rFonts w:ascii="游明朝" w:eastAsia="游明朝" w:hAnsi="游明朝" w:hint="eastAsia"/>
+          <w:szCs w:val="21"/>
+        </w:rPr>
+        <w:t>１．</w:t>
+      </w:r>
+      <w:r>
+        <w:rPr>
+          <w:rFonts w:ascii="游明朝" w:eastAsia="游明朝" w:hAnsi="游明朝" w:hint="eastAsia"/>
+          <w:szCs w:val="21"/>
+        </w:rPr>
+        <w:t>火山</w:t>
+      </w:r>
+      <w:r>
+        <w:rPr>
+          <w:rFonts w:ascii="游明朝" w:eastAsia="游明朝" w:hAnsi="游明朝" w:hint="eastAsia"/>
+          <w:szCs w:val="21"/>
+        </w:rPr>
+        <w:t>ハザード対策</w:t>
+      </w:r>
+      <w:r>
+        <w:rPr>
+          <w:rFonts w:ascii="游明朝" w:eastAsia="游明朝" w:hAnsi="游明朝" w:hint="eastAsia"/>
+          <w:szCs w:val="21"/>
+        </w:rPr>
+        <w:t>研究</w:t>
+      </w:r>
+      <w:r>
+        <w:rPr>
+          <w:rFonts w:ascii="游明朝" w:eastAsia="游明朝" w:hAnsi="游明朝" w:hint="eastAsia"/>
+          <w:szCs w:val="21"/>
+        </w:rPr>
+        <w:t>人材</w:t>
+      </w:r>
+      <w:r>
+        <w:rPr>
+          <w:rFonts w:ascii="游明朝" w:eastAsia="游明朝" w:hAnsi="游明朝" w:hint="eastAsia"/>
+          <w:szCs w:val="21"/>
+        </w:rPr>
+        <w:t>育成プログラム調査票</w:t>
+      </w:r>
+    </w:p>
+    <w:p>
+      <w:pPr>
+        <w:ind w:leftChars="675" w:left="1418"/>
+        <w:jc w:val="left"/>
+        <w:rPr>
+          <w:rFonts w:ascii="游明朝" w:eastAsia="游明朝" w:hAnsi="游明朝"/>
+          <w:szCs w:val="21"/>
+        </w:rPr>
+      </w:pPr>
+      <w:r>
+        <w:rPr>
+          <w:rFonts w:ascii="游明朝" w:eastAsia="游明朝" w:hAnsi="游明朝" w:hint="eastAsia"/>
+          <w:szCs w:val="21"/>
+        </w:rPr>
+        <w:t>本プログラムのホームページ</w:t>
+      </w:r>
+      <w:r>
+        <w:rPr>
+          <w:rFonts w:ascii="游明朝" w:eastAsia="游明朝" w:hAnsi="游明朝" w:hint="eastAsia"/>
+          <w:szCs w:val="21"/>
+        </w:rPr>
+        <w:t xml:space="preserve"> </w:t>
+      </w:r>
+      <w:hyperlink r:id="rId7" w:history="1">
         <w:r>
           <w:rPr>
-            <w:rFonts w:ascii="游明朝" w:eastAsia="游明朝" w:hAnsi="游明朝" w:hint="eastAsia"/>
-            <w:bCs/>
+            <w:rStyle w:val="aa"/>
+            <w:rFonts w:ascii="游明朝" w:eastAsia="游明朝" w:hAnsi="游明朝"/>
             <w:szCs w:val="21"/>
           </w:rPr>
-          <w:t>基礎コース（</w:t>
+          <w:t>https://vlead-edu.github.io/vlead-edu/</w:t>
         </w:r>
-      </w:ins>
-      <w:r>
-        <w:rPr>
-          <w:rFonts w:ascii="游明朝" w:eastAsia="游明朝" w:hAnsi="游明朝" w:hint="eastAsia"/>
-          <w:bCs/>
-          <w:szCs w:val="21"/>
-        </w:rPr>
-        <w:t>コンソーシアムに参画する大学</w:t>
-      </w:r>
-      <w:r>
-        <w:rPr>
-          <w:rFonts w:ascii="游明朝" w:eastAsia="游明朝" w:hAnsi="游明朝" w:hint="eastAsia"/>
-          <w:bCs/>
-          <w:szCs w:val="21"/>
-        </w:rPr>
-        <w:t>の修士1年生</w:t>
-      </w:r>
-      <w:ins w:id="21" w:author="作成者">
+      </w:hyperlink>
+      <w:r>
+        <w:rPr>
+          <w:rStyle w:val="aa"/>
+          <w:rFonts w:ascii="游明朝" w:eastAsia="游明朝" w:hAnsi="游明朝"/>
+          <w:color w:val="auto"/>
+          <w:szCs w:val="21"/>
+          <w:u w:val="none"/>
+        </w:rPr>
+        <w:t xml:space="preserve"> </w:t>
+      </w:r>
+      <w:r>
+        <w:rPr>
+          <w:rFonts w:ascii="游明朝" w:eastAsia="游明朝" w:hAnsi="游明朝" w:hint="eastAsia"/>
+          <w:szCs w:val="21"/>
+        </w:rPr>
+        <w:t>より</w:t>
+      </w:r>
+      <w:r>
+        <w:rPr>
+          <w:rFonts w:ascii="游明朝" w:eastAsia="游明朝" w:hAnsi="游明朝" w:hint="eastAsia"/>
+          <w:szCs w:val="21"/>
+        </w:rPr>
+        <w:t>調査票</w:t>
+      </w:r>
+      <w:r>
+        <w:rPr>
+          <w:rFonts w:ascii="游明朝" w:eastAsia="游明朝" w:hAnsi="游明朝" w:hint="eastAsia"/>
+          <w:szCs w:val="21"/>
+        </w:rPr>
+        <w:t>をダウンロードし、必要事項を記入の上、</w:t>
+      </w:r>
+      <w:r>
+        <w:rPr>
+          <w:rFonts w:ascii="游明朝" w:eastAsia="游明朝" w:hAnsi="游明朝"/>
+          <w:szCs w:val="21"/>
+        </w:rPr>
+        <w:t>pdfとして</w:t>
+      </w:r>
+      <w:r>
+        <w:rPr>
+          <w:rFonts w:ascii="游明朝" w:eastAsia="游明朝" w:hAnsi="游明朝" w:hint="eastAsia"/>
+          <w:szCs w:val="21"/>
+        </w:rPr>
+        <w:t>メールで</w:t>
+      </w:r>
+      <w:r>
+        <w:rPr>
+          <w:rFonts w:ascii="游明朝" w:eastAsia="游明朝" w:hAnsi="游明朝"/>
+          <w:szCs w:val="21"/>
+        </w:rPr>
+        <w:t>提出</w:t>
+      </w:r>
+      <w:r>
+        <w:rPr>
+          <w:rFonts w:ascii="游明朝" w:eastAsia="游明朝" w:hAnsi="游明朝" w:hint="eastAsia"/>
+          <w:szCs w:val="21"/>
+        </w:rPr>
+        <w:t>してください</w:t>
+      </w:r>
+      <w:r>
+        <w:rPr>
+          <w:rFonts w:ascii="游明朝" w:eastAsia="游明朝" w:hAnsi="游明朝"/>
+          <w:szCs w:val="21"/>
+        </w:rPr>
+        <w:t>。</w:t>
+      </w:r>
+    </w:p>
+    <w:p>
+      <w:pPr>
+        <w:ind w:leftChars="406" w:left="1134" w:hangingChars="134" w:hanging="281"/>
+        <w:rPr>
+          <w:rFonts w:ascii="游明朝" w:eastAsia="游明朝" w:hAnsi="游明朝"/>
+        </w:rPr>
+      </w:pPr>
+      <w:r>
+        <w:rPr>
+          <w:rFonts w:ascii="游明朝" w:eastAsia="游明朝" w:hAnsi="游明朝" w:hint="eastAsia"/>
+        </w:rPr>
+        <w:t>２．応募者の成績証明書</w:t>
+      </w:r>
+    </w:p>
+    <w:p>
+      <w:pPr>
+        <w:ind w:leftChars="675" w:left="1418"/>
+        <w:jc w:val="left"/>
+        <w:rPr>
+          <w:rFonts w:ascii="游明朝" w:eastAsia="游明朝" w:hAnsi="游明朝"/>
+        </w:rPr>
+      </w:pPr>
+      <w:r>
+        <w:rPr>
+          <w:rFonts w:ascii="游明朝" w:eastAsia="游明朝" w:hAnsi="游明朝" w:hint="eastAsia"/>
+          <w:szCs w:val="21"/>
+        </w:rPr>
+        <w:t>卒業した大学の成績</w:t>
+      </w:r>
+      <w:r>
+        <w:rPr>
+          <w:rFonts w:ascii="游明朝" w:eastAsia="游明朝" w:hAnsi="游明朝" w:hint="eastAsia"/>
+        </w:rPr>
+        <w:t>を郵送してください。</w:t>
+      </w:r>
+      <w:bookmarkStart w:id="0" w:name="_Hlk84847457"/>
+    </w:p>
+    <w:bookmarkEnd w:id="0"/>
+    <w:p>
+      <w:pPr>
+        <w:ind w:leftChars="406" w:left="1134" w:hangingChars="134" w:hanging="281"/>
+        <w:jc w:val="left"/>
+        <w:rPr>
+          <w:rFonts w:ascii="游明朝" w:eastAsia="游明朝" w:hAnsi="游明朝"/>
+          <w:szCs w:val="21"/>
+        </w:rPr>
+      </w:pPr>
+      <w:r>
+        <w:rPr>
+          <w:rFonts w:ascii="游明朝" w:eastAsia="游明朝" w:hAnsi="游明朝" w:hint="eastAsia"/>
+          <w:szCs w:val="21"/>
+        </w:rPr>
+        <w:t>３．指導教員の所見</w:t>
+      </w:r>
+    </w:p>
+    <w:p>
+      <w:pPr>
+        <w:ind w:leftChars="675" w:left="1418"/>
+        <w:jc w:val="left"/>
+        <w:rPr>
+          <w:rFonts w:ascii="游明朝" w:eastAsia="游明朝" w:hAnsi="游明朝"/>
+          <w:szCs w:val="21"/>
+        </w:rPr>
+      </w:pPr>
+      <w:r>
+        <w:rPr>
+          <w:rFonts w:ascii="游明朝" w:eastAsia="游明朝" w:hAnsi="游明朝" w:hint="eastAsia"/>
+          <w:szCs w:val="21"/>
+        </w:rPr>
+        <w:t>20</w:t>
+      </w:r>
+      <w:r>
+        <w:rPr>
+          <w:rFonts w:ascii="游明朝" w:eastAsia="游明朝" w:hAnsi="游明朝" w:hint="eastAsia"/>
+          <w:szCs w:val="21"/>
+        </w:rPr>
+        <w:t>2</w:t>
+      </w:r>
+      <w:r>
+        <w:rPr>
+          <w:rFonts w:ascii="游明朝" w:eastAsia="游明朝" w:hAnsi="游明朝" w:hint="eastAsia"/>
+          <w:szCs w:val="21"/>
+        </w:rPr>
+        <w:t>6</w:t>
+      </w:r>
+      <w:r>
+        <w:rPr>
+          <w:rFonts w:ascii="游明朝" w:eastAsia="游明朝" w:hAnsi="游明朝" w:hint="eastAsia"/>
+          <w:szCs w:val="21"/>
+        </w:rPr>
+        <w:t>年4月に所属</w:t>
+      </w:r>
+      <w:r>
+        <w:rPr>
+          <w:rFonts w:ascii="游明朝" w:eastAsia="游明朝" w:hAnsi="游明朝" w:hint="eastAsia"/>
+          <w:szCs w:val="21"/>
+        </w:rPr>
+        <w:t>して</w:t>
+      </w:r>
+      <w:r>
+        <w:rPr>
+          <w:rFonts w:ascii="游明朝" w:eastAsia="游明朝" w:hAnsi="游明朝" w:hint="eastAsia"/>
+          <w:szCs w:val="21"/>
+        </w:rPr>
+        <w:t>い</w:t>
+      </w:r>
+      <w:r>
+        <w:rPr>
+          <w:rFonts w:ascii="游明朝" w:eastAsia="游明朝" w:hAnsi="游明朝" w:hint="eastAsia"/>
+          <w:szCs w:val="21"/>
+        </w:rPr>
+        <w:t>る大学院の指導教員</w:t>
+      </w:r>
+      <w:r>
+        <w:rPr>
+          <w:rFonts w:ascii="游明朝" w:eastAsia="游明朝" w:hAnsi="游明朝" w:hint="eastAsia"/>
+          <w:szCs w:val="21"/>
+        </w:rPr>
+        <w:t>に</w:t>
+      </w:r>
+      <w:r>
+        <w:rPr>
+          <w:rFonts w:ascii="游明朝" w:eastAsia="游明朝" w:hAnsi="游明朝" w:hint="eastAsia"/>
+          <w:szCs w:val="21"/>
+        </w:rPr>
+        <w:t>、</w:t>
+      </w:r>
+      <w:r>
+        <w:rPr>
+          <w:rFonts w:ascii="游明朝" w:eastAsia="游明朝" w:hAnsi="游明朝" w:hint="eastAsia"/>
+          <w:szCs w:val="21"/>
+        </w:rPr>
+        <w:t>所見を記入し、pdfとして</w:t>
+      </w:r>
+      <w:r>
+        <w:rPr>
+          <w:rFonts w:ascii="游明朝" w:eastAsia="游明朝" w:hAnsi="游明朝" w:hint="eastAsia"/>
+          <w:szCs w:val="21"/>
+        </w:rPr>
+        <w:t>応募用</w:t>
+      </w:r>
+      <w:r>
+        <w:rPr>
+          <w:rFonts w:ascii="游明朝" w:eastAsia="游明朝" w:hAnsi="游明朝" w:hint="eastAsia"/>
+          <w:szCs w:val="21"/>
+        </w:rPr>
+        <w:t>メール</w:t>
+      </w:r>
+      <w:r>
+        <w:rPr>
+          <w:rFonts w:ascii="游明朝" w:eastAsia="游明朝" w:hAnsi="游明朝" w:hint="eastAsia"/>
+          <w:szCs w:val="21"/>
+        </w:rPr>
+        <w:t>アドレス宛に直接</w:t>
+      </w:r>
+      <w:r>
+        <w:rPr>
+          <w:rFonts w:ascii="游明朝" w:eastAsia="游明朝" w:hAnsi="游明朝" w:hint="eastAsia"/>
+          <w:szCs w:val="21"/>
+        </w:rPr>
+        <w:t>提出するよう依頼してください。</w:t>
+      </w:r>
+      <w:r>
+        <w:rPr>
+          <w:rFonts w:ascii="游明朝" w:eastAsia="游明朝" w:hAnsi="游明朝" w:hint="eastAsia"/>
+          <w:szCs w:val="21"/>
+        </w:rPr>
+        <w:t>なお、本プログラム</w:t>
+      </w:r>
+      <w:r>
+        <w:rPr>
+          <w:rFonts w:ascii="游明朝" w:eastAsia="游明朝" w:hAnsi="游明朝" w:hint="eastAsia"/>
+          <w:szCs w:val="21"/>
+        </w:rPr>
+        <w:t>への</w:t>
+      </w:r>
+      <w:r>
+        <w:rPr>
+          <w:rFonts w:ascii="游明朝" w:eastAsia="游明朝" w:hAnsi="游明朝" w:hint="eastAsia"/>
+          <w:szCs w:val="21"/>
+        </w:rPr>
+        <w:t>申し込</w:t>
+      </w:r>
+      <w:r>
+        <w:rPr>
+          <w:rFonts w:ascii="游明朝" w:eastAsia="游明朝" w:hAnsi="游明朝" w:hint="eastAsia"/>
+          <w:szCs w:val="21"/>
+        </w:rPr>
+        <w:t>み</w:t>
+      </w:r>
+      <w:r>
+        <w:rPr>
+          <w:rFonts w:ascii="游明朝" w:eastAsia="游明朝" w:hAnsi="游明朝" w:hint="eastAsia"/>
+          <w:szCs w:val="21"/>
+        </w:rPr>
+        <w:t>の承諾</w:t>
+      </w:r>
+      <w:r>
+        <w:rPr>
+          <w:rFonts w:ascii="游明朝" w:eastAsia="游明朝" w:hAnsi="游明朝" w:hint="eastAsia"/>
+          <w:szCs w:val="21"/>
+        </w:rPr>
+        <w:t>を</w:t>
+      </w:r>
+      <w:r>
+        <w:rPr>
+          <w:rFonts w:ascii="游明朝" w:eastAsia="游明朝" w:hAnsi="游明朝" w:hint="eastAsia"/>
+          <w:szCs w:val="21"/>
+        </w:rPr>
+        <w:t>得てください。</w:t>
+      </w:r>
+      <w:r>
+        <w:rPr>
+          <w:rFonts w:ascii="游明朝" w:eastAsia="游明朝" w:hAnsi="游明朝" w:hint="eastAsia"/>
+          <w:szCs w:val="21"/>
+        </w:rPr>
+        <w:t>所見の用紙は、本プログラムのホームページ</w:t>
+      </w:r>
+      <w:r>
+        <w:rPr>
+          <w:rFonts w:ascii="游明朝" w:eastAsia="游明朝" w:hAnsi="游明朝" w:hint="eastAsia"/>
+          <w:szCs w:val="21"/>
+        </w:rPr>
+        <w:t xml:space="preserve"> </w:t>
+      </w:r>
+      <w:hyperlink r:id="rId8" w:history="1">
         <w:r>
           <w:rPr>
-            <w:rFonts w:ascii="游明朝" w:eastAsia="游明朝" w:hAnsi="游明朝" w:hint="eastAsia"/>
-            <w:bCs/>
+            <w:rStyle w:val="aa"/>
+            <w:rFonts w:ascii="游明朝" w:eastAsia="游明朝" w:hAnsi="游明朝"/>
             <w:szCs w:val="21"/>
           </w:rPr>
-          <w:t>）</w:t>
+          <w:t>https://vlead-edu.github.io/vlead-edu/</w:t>
         </w:r>
-      </w:ins>
-    </w:p>
-    <w:p>
-      <w:pPr>
-        <w:ind w:leftChars="406" w:left="1134" w:hangingChars="134" w:hanging="281"/>
+      </w:hyperlink>
+      <w:r>
+        <w:rPr>
+          <w:rFonts w:ascii="游明朝" w:eastAsia="游明朝" w:hAnsi="游明朝"/>
+          <w:szCs w:val="21"/>
+        </w:rPr>
+        <w:t xml:space="preserve"> </w:t>
+      </w:r>
+      <w:r>
+        <w:rPr>
+          <w:rFonts w:ascii="游明朝" w:eastAsia="游明朝" w:hAnsi="游明朝" w:hint="eastAsia"/>
+          <w:szCs w:val="21"/>
+        </w:rPr>
+        <w:t>よりダウンロードできます。</w:t>
+      </w:r>
+    </w:p>
+    <w:p>
+      <w:pPr>
         <w:jc w:val="left"/>
         <w:rPr>
           <w:rFonts w:ascii="游明朝" w:eastAsia="游明朝" w:hAnsi="游明朝"/>
@@ -1539,47 +1860,46 @@
           <w:rFonts w:ascii="游明朝" w:eastAsia="游明朝" w:hAnsi="游明朝" w:hint="eastAsia"/>
           <w:szCs w:val="21"/>
         </w:rPr>
-        <w:t>１．</w:t>
-      </w:r>
-      <w:r>
-        <w:rPr>
-          <w:rFonts w:ascii="游明朝" w:eastAsia="游明朝" w:hAnsi="游明朝" w:hint="eastAsia"/>
-          <w:szCs w:val="21"/>
-        </w:rPr>
-        <w:t>火山</w:t>
-      </w:r>
-      <w:r>
-        <w:rPr>
-          <w:rFonts w:ascii="游明朝" w:eastAsia="游明朝" w:hAnsi="游明朝" w:hint="eastAsia"/>
-          <w:szCs w:val="21"/>
-        </w:rPr>
-        <w:t>ハザード対策</w:t>
-      </w:r>
-      <w:r>
-        <w:rPr>
-          <w:rFonts w:ascii="游明朝" w:eastAsia="游明朝" w:hAnsi="游明朝" w:hint="eastAsia"/>
-          <w:szCs w:val="21"/>
-        </w:rPr>
-        <w:t>研究</w:t>
-      </w:r>
-      <w:r>
-        <w:rPr>
-          <w:rFonts w:ascii="游明朝" w:eastAsia="游明朝" w:hAnsi="游明朝" w:hint="eastAsia"/>
-          <w:szCs w:val="21"/>
-        </w:rPr>
-        <w:t>人材</w:t>
-      </w:r>
-      <w:r>
-        <w:rPr>
-          <w:rFonts w:ascii="游明朝" w:eastAsia="游明朝" w:hAnsi="游明朝" w:hint="eastAsia"/>
-          <w:szCs w:val="21"/>
-        </w:rPr>
-        <w:t>育成プログラム調査票</w:t>
-      </w:r>
-    </w:p>
-    <w:p>
-      <w:pPr>
-        <w:ind w:leftChars="675" w:left="1418"/>
+        <w:t xml:space="preserve">　　（2）</w:t>
+      </w:r>
+      <w:r>
+        <w:rPr>
+          <w:rFonts w:ascii="游明朝" w:eastAsia="游明朝" w:hAnsi="游明朝" w:hint="eastAsia"/>
+          <w:szCs w:val="21"/>
+        </w:rPr>
+        <w:t>応用コース（</w:t>
+      </w:r>
+      <w:r>
+        <w:rPr>
+          <w:rFonts w:ascii="游明朝" w:eastAsia="游明朝" w:hAnsi="游明朝" w:hint="eastAsia"/>
+          <w:szCs w:val="21"/>
+        </w:rPr>
+        <w:t>次世代火山研究者育成プログラムの</w:t>
+      </w:r>
+      <w:r>
+        <w:rPr>
+          <w:rFonts w:ascii="游明朝" w:eastAsia="游明朝" w:hAnsi="游明朝" w:hint="eastAsia"/>
+          <w:szCs w:val="21"/>
+        </w:rPr>
+        <w:t>基礎</w:t>
+      </w:r>
+      <w:r>
+        <w:rPr>
+          <w:rFonts w:ascii="游明朝" w:eastAsia="游明朝" w:hAnsi="游明朝" w:hint="eastAsia"/>
+          <w:szCs w:val="21"/>
+        </w:rPr>
+        <w:t>コース修了生</w:t>
+      </w:r>
+      <w:r>
+        <w:rPr>
+          <w:rFonts w:ascii="游明朝" w:eastAsia="游明朝" w:hAnsi="游明朝" w:hint="eastAsia"/>
+          <w:szCs w:val="21"/>
+        </w:rPr>
+        <w:t>）</w:t>
+      </w:r>
+    </w:p>
+    <w:p>
+      <w:pPr>
         <w:jc w:val="left"/>
         <w:rPr>
           <w:rFonts w:ascii="游明朝" w:eastAsia="游明朝" w:hAnsi="游明朝"/>
@@ -1591,490 +1911,15 @@
           <w:rFonts w:ascii="游明朝" w:eastAsia="游明朝" w:hAnsi="游明朝" w:hint="eastAsia"/>
           <w:szCs w:val="21"/>
         </w:rPr>
-        <w:t>本プログラムのホームページ</w:t>
-      </w:r>
-      <w:r>
-        <w:rPr>
-          <w:rFonts w:ascii="游明朝" w:eastAsia="游明朝" w:hAnsi="游明朝" w:hint="eastAsia"/>
-          <w:szCs w:val="21"/>
-        </w:rPr>
-        <w:t xml:space="preserve"> </w:t>
-      </w:r>
-      <w:r>
-        <w:rPr>
-          <w:rStyle w:val="aa"/>
-          <w:rFonts w:ascii="游明朝" w:eastAsia="游明朝" w:hAnsi="游明朝"/>
-          <w:color w:val="auto"/>
-          <w:szCs w:val="21"/>
-          <w:highlight w:val="yellow"/>
-          <w:u w:val="none"/>
-        </w:rPr>
-        <w:t>http</w:t>
-      </w:r>
-      <w:r>
-        <w:rPr>
-          <w:rStyle w:val="aa"/>
-          <w:rFonts w:ascii="游明朝" w:eastAsia="游明朝" w:hAnsi="游明朝"/>
-          <w:color w:val="auto"/>
-          <w:szCs w:val="21"/>
-          <w:highlight w:val="yellow"/>
-          <w:u w:val="none"/>
-        </w:rPr>
-        <w:t>s</w:t>
-      </w:r>
-      <w:r>
-        <w:rPr>
-          <w:rStyle w:val="aa"/>
-          <w:rFonts w:ascii="游明朝" w:eastAsia="游明朝" w:hAnsi="游明朝"/>
-          <w:color w:val="auto"/>
-          <w:szCs w:val="21"/>
-          <w:highlight w:val="yellow"/>
-          <w:u w:val="none"/>
-        </w:rPr>
-        <w:t>://</w:t>
-      </w:r>
-      <w:r>
-        <w:rPr>
-          <w:rStyle w:val="aa"/>
-          <w:rFonts w:ascii="游明朝" w:eastAsia="游明朝" w:hAnsi="游明朝"/>
-          <w:color w:val="auto"/>
-          <w:szCs w:val="21"/>
-          <w:highlight w:val="yellow"/>
-          <w:u w:val="none"/>
-        </w:rPr>
-        <w:t>kazan-edu.jp/students.php</w:t>
-      </w:r>
-      <w:r>
-        <w:rPr>
-          <w:rStyle w:val="aa"/>
-          <w:rFonts w:ascii="游明朝" w:eastAsia="游明朝" w:hAnsi="游明朝" w:hint="eastAsia"/>
-          <w:color w:val="auto"/>
-          <w:szCs w:val="21"/>
-          <w:u w:val="none"/>
-        </w:rPr>
-        <w:t xml:space="preserve">　</w:t>
-      </w:r>
-      <w:r>
-        <w:rPr>
-          <w:rFonts w:ascii="游明朝" w:eastAsia="游明朝" w:hAnsi="游明朝" w:hint="eastAsia"/>
-          <w:szCs w:val="21"/>
-        </w:rPr>
-        <w:t>より</w:t>
-      </w:r>
-      <w:r>
-        <w:rPr>
-          <w:rFonts w:ascii="游明朝" w:eastAsia="游明朝" w:hAnsi="游明朝" w:hint="eastAsia"/>
-          <w:szCs w:val="21"/>
-        </w:rPr>
-        <w:t>調査票</w:t>
-      </w:r>
-      <w:r>
-        <w:rPr>
-          <w:rFonts w:ascii="游明朝" w:eastAsia="游明朝" w:hAnsi="游明朝" w:hint="eastAsia"/>
-          <w:szCs w:val="21"/>
-        </w:rPr>
-        <w:t>をダウンロードし、必要事項を記入の上、</w:t>
-      </w:r>
-      <w:r>
-        <w:rPr>
-          <w:rFonts w:ascii="游明朝" w:eastAsia="游明朝" w:hAnsi="游明朝"/>
-          <w:szCs w:val="21"/>
-        </w:rPr>
-        <w:t>pdfとして</w:t>
-      </w:r>
-      <w:r>
-        <w:rPr>
-          <w:rFonts w:ascii="游明朝" w:eastAsia="游明朝" w:hAnsi="游明朝" w:hint="eastAsia"/>
-          <w:szCs w:val="21"/>
-        </w:rPr>
-        <w:t>メールで</w:t>
-      </w:r>
-      <w:r>
-        <w:rPr>
-          <w:rFonts w:ascii="游明朝" w:eastAsia="游明朝" w:hAnsi="游明朝"/>
-          <w:szCs w:val="21"/>
-        </w:rPr>
-        <w:t>提出</w:t>
-      </w:r>
-      <w:r>
-        <w:rPr>
-          <w:rFonts w:ascii="游明朝" w:eastAsia="游明朝" w:hAnsi="游明朝" w:hint="eastAsia"/>
-          <w:szCs w:val="21"/>
-        </w:rPr>
-        <w:t>してください</w:t>
-      </w:r>
-      <w:r>
-        <w:rPr>
-          <w:rFonts w:ascii="游明朝" w:eastAsia="游明朝" w:hAnsi="游明朝"/>
-          <w:szCs w:val="21"/>
-        </w:rPr>
-        <w:t>。</w:t>
-      </w:r>
-    </w:p>
-    <w:p>
-      <w:pPr>
-        <w:ind w:leftChars="406" w:left="1134" w:hangingChars="134" w:hanging="281"/>
-        <w:rPr>
-          <w:rFonts w:ascii="游明朝" w:eastAsia="游明朝" w:hAnsi="游明朝"/>
-        </w:rPr>
-      </w:pPr>
-      <w:r>
-        <w:rPr>
-          <w:rFonts w:ascii="游明朝" w:eastAsia="游明朝" w:hAnsi="游明朝" w:hint="eastAsia"/>
-        </w:rPr>
-        <w:t>２．応募者の成績証明書</w:t>
-      </w:r>
-    </w:p>
-    <w:p>
-      <w:pPr>
-        <w:ind w:leftChars="675" w:left="1418"/>
-        <w:jc w:val="left"/>
-        <w:rPr>
-          <w:rFonts w:ascii="游明朝" w:eastAsia="游明朝" w:hAnsi="游明朝"/>
-        </w:rPr>
-      </w:pPr>
-      <w:r>
-        <w:rPr>
-          <w:rFonts w:ascii="游明朝" w:eastAsia="游明朝" w:hAnsi="游明朝" w:hint="eastAsia"/>
-          <w:szCs w:val="21"/>
-        </w:rPr>
-        <w:t>卒業した大学の成績</w:t>
-      </w:r>
-      <w:r>
-        <w:rPr>
-          <w:rFonts w:ascii="游明朝" w:eastAsia="游明朝" w:hAnsi="游明朝" w:hint="eastAsia"/>
-        </w:rPr>
-        <w:t>を郵送してください。</w:t>
-      </w:r>
-      <w:bookmarkStart w:id="22" w:name="_Hlk84847457"/>
-    </w:p>
-    <w:bookmarkEnd w:id="22"/>
-    <w:p>
-      <w:pPr>
-        <w:ind w:leftChars="406" w:left="1134" w:hangingChars="134" w:hanging="281"/>
-        <w:jc w:val="left"/>
-        <w:rPr>
-          <w:rFonts w:ascii="游明朝" w:eastAsia="游明朝" w:hAnsi="游明朝"/>
-          <w:szCs w:val="21"/>
-        </w:rPr>
-      </w:pPr>
-      <w:r>
-        <w:rPr>
-          <w:rFonts w:ascii="游明朝" w:eastAsia="游明朝" w:hAnsi="游明朝" w:hint="eastAsia"/>
-          <w:szCs w:val="21"/>
-        </w:rPr>
-        <w:t>３．指導教員の所見</w:t>
-      </w:r>
-    </w:p>
-    <w:p>
-      <w:pPr>
-        <w:ind w:leftChars="675" w:left="1418"/>
-        <w:jc w:val="left"/>
-        <w:rPr>
-          <w:rFonts w:ascii="游明朝" w:eastAsia="游明朝" w:hAnsi="游明朝"/>
-          <w:szCs w:val="21"/>
-        </w:rPr>
-      </w:pPr>
-      <w:r>
-        <w:rPr>
-          <w:rFonts w:ascii="游明朝" w:eastAsia="游明朝" w:hAnsi="游明朝" w:hint="eastAsia"/>
-          <w:szCs w:val="21"/>
-        </w:rPr>
-        <w:t>20</w:t>
-      </w:r>
-      <w:r>
-        <w:rPr>
-          <w:rFonts w:ascii="游明朝" w:eastAsia="游明朝" w:hAnsi="游明朝" w:hint="eastAsia"/>
-          <w:szCs w:val="21"/>
-        </w:rPr>
-        <w:t>2</w:t>
-      </w:r>
-      <w:r>
-        <w:rPr>
-          <w:rFonts w:ascii="游明朝" w:eastAsia="游明朝" w:hAnsi="游明朝" w:hint="eastAsia"/>
-          <w:szCs w:val="21"/>
-        </w:rPr>
-        <w:t>6</w:t>
-      </w:r>
-      <w:r>
-        <w:rPr>
-          <w:rFonts w:ascii="游明朝" w:eastAsia="游明朝" w:hAnsi="游明朝" w:hint="eastAsia"/>
-          <w:szCs w:val="21"/>
-        </w:rPr>
-        <w:t>年4月に所属</w:t>
-      </w:r>
-      <w:r>
-        <w:rPr>
-          <w:rFonts w:ascii="游明朝" w:eastAsia="游明朝" w:hAnsi="游明朝" w:hint="eastAsia"/>
-          <w:szCs w:val="21"/>
-        </w:rPr>
-        <w:t>して</w:t>
-      </w:r>
-      <w:r>
-        <w:rPr>
-          <w:rFonts w:ascii="游明朝" w:eastAsia="游明朝" w:hAnsi="游明朝" w:hint="eastAsia"/>
-          <w:szCs w:val="21"/>
-        </w:rPr>
-        <w:t>い</w:t>
-      </w:r>
-      <w:r>
-        <w:rPr>
-          <w:rFonts w:ascii="游明朝" w:eastAsia="游明朝" w:hAnsi="游明朝" w:hint="eastAsia"/>
-          <w:szCs w:val="21"/>
-        </w:rPr>
-        <w:t>る大学院の指導教員</w:t>
-      </w:r>
-      <w:r>
-        <w:rPr>
-          <w:rFonts w:ascii="游明朝" w:eastAsia="游明朝" w:hAnsi="游明朝" w:hint="eastAsia"/>
-          <w:szCs w:val="21"/>
-        </w:rPr>
-        <w:t>に</w:t>
-      </w:r>
-      <w:r>
-        <w:rPr>
-          <w:rFonts w:ascii="游明朝" w:eastAsia="游明朝" w:hAnsi="游明朝" w:hint="eastAsia"/>
-          <w:szCs w:val="21"/>
-        </w:rPr>
-        <w:t>、</w:t>
-      </w:r>
-      <w:r>
-        <w:rPr>
-          <w:rFonts w:ascii="游明朝" w:eastAsia="游明朝" w:hAnsi="游明朝" w:hint="eastAsia"/>
-          <w:szCs w:val="21"/>
-        </w:rPr>
-        <w:t>所見を記入し、pdfとして</w:t>
-      </w:r>
-      <w:r>
-        <w:rPr>
-          <w:rFonts w:ascii="游明朝" w:eastAsia="游明朝" w:hAnsi="游明朝" w:hint="eastAsia"/>
-          <w:szCs w:val="21"/>
-        </w:rPr>
-        <w:t>応募用</w:t>
-      </w:r>
-      <w:r>
-        <w:rPr>
-          <w:rFonts w:ascii="游明朝" w:eastAsia="游明朝" w:hAnsi="游明朝" w:hint="eastAsia"/>
-          <w:szCs w:val="21"/>
-        </w:rPr>
-        <w:t>メール</w:t>
-      </w:r>
-      <w:r>
-        <w:rPr>
-          <w:rFonts w:ascii="游明朝" w:eastAsia="游明朝" w:hAnsi="游明朝" w:hint="eastAsia"/>
-          <w:szCs w:val="21"/>
-        </w:rPr>
-        <w:t>アドレス宛に直接</w:t>
-      </w:r>
-      <w:r>
-        <w:rPr>
-          <w:rFonts w:ascii="游明朝" w:eastAsia="游明朝" w:hAnsi="游明朝" w:hint="eastAsia"/>
-          <w:szCs w:val="21"/>
-        </w:rPr>
-        <w:t>提出するよう依頼してください。</w:t>
-      </w:r>
-      <w:r>
-        <w:rPr>
-          <w:rFonts w:ascii="游明朝" w:eastAsia="游明朝" w:hAnsi="游明朝" w:hint="eastAsia"/>
-          <w:szCs w:val="21"/>
-        </w:rPr>
-        <w:t>なお、本プログラム</w:t>
-      </w:r>
-      <w:r>
-        <w:rPr>
-          <w:rFonts w:ascii="游明朝" w:eastAsia="游明朝" w:hAnsi="游明朝" w:hint="eastAsia"/>
-          <w:szCs w:val="21"/>
-        </w:rPr>
-        <w:t>への</w:t>
-      </w:r>
-      <w:r>
-        <w:rPr>
-          <w:rFonts w:ascii="游明朝" w:eastAsia="游明朝" w:hAnsi="游明朝" w:hint="eastAsia"/>
-          <w:szCs w:val="21"/>
-        </w:rPr>
-        <w:t>申し込</w:t>
-      </w:r>
-      <w:r>
-        <w:rPr>
-          <w:rFonts w:ascii="游明朝" w:eastAsia="游明朝" w:hAnsi="游明朝" w:hint="eastAsia"/>
-          <w:szCs w:val="21"/>
-        </w:rPr>
-        <w:t>み</w:t>
-      </w:r>
-      <w:r>
-        <w:rPr>
-          <w:rFonts w:ascii="游明朝" w:eastAsia="游明朝" w:hAnsi="游明朝" w:hint="eastAsia"/>
-          <w:szCs w:val="21"/>
-        </w:rPr>
-        <w:t>の承諾</w:t>
-      </w:r>
-      <w:r>
-        <w:rPr>
-          <w:rFonts w:ascii="游明朝" w:eastAsia="游明朝" w:hAnsi="游明朝" w:hint="eastAsia"/>
-          <w:szCs w:val="21"/>
-        </w:rPr>
-        <w:t>を</w:t>
-      </w:r>
-      <w:r>
-        <w:rPr>
-          <w:rFonts w:ascii="游明朝" w:eastAsia="游明朝" w:hAnsi="游明朝" w:hint="eastAsia"/>
-          <w:szCs w:val="21"/>
-        </w:rPr>
-        <w:t>得てください。</w:t>
-      </w:r>
-      <w:r>
-        <w:rPr>
-          <w:rFonts w:ascii="游明朝" w:eastAsia="游明朝" w:hAnsi="游明朝" w:hint="eastAsia"/>
-          <w:szCs w:val="21"/>
-        </w:rPr>
-        <w:t>所見の用紙は、本プログラムのホームページ</w:t>
-      </w:r>
-      <w:r>
-        <w:rPr>
-          <w:rFonts w:ascii="游明朝" w:eastAsia="游明朝" w:hAnsi="游明朝" w:hint="eastAsia"/>
-          <w:szCs w:val="21"/>
-        </w:rPr>
-        <w:t xml:space="preserve"> </w:t>
-      </w:r>
-      <w:r>
-        <w:rPr>
-          <w:rStyle w:val="aa"/>
-          <w:rFonts w:ascii="游明朝" w:eastAsia="游明朝" w:hAnsi="游明朝"/>
-          <w:color w:val="auto"/>
-          <w:szCs w:val="21"/>
-          <w:highlight w:val="yellow"/>
-          <w:u w:val="none"/>
-        </w:rPr>
-        <w:t>http</w:t>
-      </w:r>
-      <w:r>
-        <w:rPr>
-          <w:rStyle w:val="aa"/>
-          <w:rFonts w:ascii="游明朝" w:eastAsia="游明朝" w:hAnsi="游明朝"/>
-          <w:color w:val="auto"/>
-          <w:szCs w:val="21"/>
-          <w:highlight w:val="yellow"/>
-          <w:u w:val="none"/>
-        </w:rPr>
-        <w:t>s</w:t>
-      </w:r>
-      <w:r>
-        <w:rPr>
-          <w:rStyle w:val="aa"/>
-          <w:rFonts w:ascii="游明朝" w:eastAsia="游明朝" w:hAnsi="游明朝"/>
-          <w:color w:val="auto"/>
-          <w:szCs w:val="21"/>
-          <w:highlight w:val="yellow"/>
-          <w:u w:val="none"/>
-        </w:rPr>
-        <w:t>://kazan-edu.jp/students.php</w:t>
-      </w:r>
-      <w:r>
-        <w:rPr>
-          <w:rStyle w:val="aa"/>
-          <w:rFonts w:ascii="游明朝" w:eastAsia="游明朝" w:hAnsi="游明朝"/>
-          <w:color w:val="auto"/>
-          <w:szCs w:val="21"/>
-          <w:u w:val="none"/>
-        </w:rPr>
-        <w:t xml:space="preserve"> </w:t>
-      </w:r>
-      <w:r>
-        <w:rPr>
-          <w:rFonts w:ascii="游明朝" w:eastAsia="游明朝" w:hAnsi="游明朝" w:hint="eastAsia"/>
-          <w:szCs w:val="21"/>
-        </w:rPr>
-        <w:t>よりダウンロードできます。</w:t>
-      </w:r>
-    </w:p>
-    <w:p>
-      <w:pPr>
-        <w:jc w:val="left"/>
-        <w:rPr>
-          <w:rFonts w:ascii="游明朝" w:eastAsia="游明朝" w:hAnsi="游明朝"/>
-          <w:szCs w:val="21"/>
-        </w:rPr>
-      </w:pPr>
-      <w:r>
-        <w:rPr>
-          <w:rFonts w:ascii="游明朝" w:eastAsia="游明朝" w:hAnsi="游明朝" w:hint="eastAsia"/>
-          <w:szCs w:val="21"/>
-        </w:rPr>
-        <w:t xml:space="preserve">　　（2）</w:t>
-      </w:r>
-      <w:ins w:id="23" w:author="作成者">
-        <w:r>
-          <w:rPr>
-            <w:rFonts w:ascii="游明朝" w:eastAsia="游明朝" w:hAnsi="游明朝" w:hint="eastAsia"/>
-            <w:szCs w:val="21"/>
-          </w:rPr>
-          <w:t>応用コース（</w:t>
-        </w:r>
-      </w:ins>
-      <w:r>
-        <w:rPr>
-          <w:rFonts w:ascii="游明朝" w:eastAsia="游明朝" w:hAnsi="游明朝" w:hint="eastAsia"/>
-          <w:szCs w:val="21"/>
-        </w:rPr>
-        <w:t>次世代火山研究者育成プログラムの</w:t>
-      </w:r>
-      <w:r>
-        <w:rPr>
-          <w:rFonts w:ascii="游明朝" w:eastAsia="游明朝" w:hAnsi="游明朝" w:hint="eastAsia"/>
-          <w:szCs w:val="21"/>
-        </w:rPr>
-        <w:t>基礎</w:t>
-      </w:r>
-      <w:r>
-        <w:rPr>
-          <w:rFonts w:ascii="游明朝" w:eastAsia="游明朝" w:hAnsi="游明朝" w:hint="eastAsia"/>
-          <w:szCs w:val="21"/>
-        </w:rPr>
-        <w:t>コース修了生</w:t>
-      </w:r>
-      <w:ins w:id="24" w:author="作成者">
-        <w:r>
-          <w:rPr>
-            <w:rFonts w:ascii="游明朝" w:eastAsia="游明朝" w:hAnsi="游明朝" w:hint="eastAsia"/>
-            <w:szCs w:val="21"/>
-          </w:rPr>
-          <w:t>）</w:t>
-        </w:r>
-      </w:ins>
-    </w:p>
-    <w:p>
-      <w:pPr>
-        <w:jc w:val="left"/>
-        <w:rPr>
-          <w:rFonts w:ascii="游明朝" w:eastAsia="游明朝" w:hAnsi="游明朝"/>
-          <w:szCs w:val="21"/>
-        </w:rPr>
-      </w:pPr>
-      <w:r>
-        <w:rPr>
-          <w:rFonts w:ascii="游明朝" w:eastAsia="游明朝" w:hAnsi="游明朝" w:hint="eastAsia"/>
-          <w:szCs w:val="21"/>
-        </w:rPr>
         <w:t xml:space="preserve">　　　　 1．</w:t>
       </w:r>
-      <w:del w:id="25" w:author="作成者">
-        <w:r>
-          <w:rPr>
-            <w:rFonts w:ascii="游明朝" w:eastAsia="游明朝" w:hAnsi="游明朝" w:hint="eastAsia"/>
-            <w:szCs w:val="21"/>
-          </w:rPr>
-          <w:delText>発展</w:delText>
-        </w:r>
-      </w:del>
-      <w:ins w:id="26" w:author="作成者">
-        <w:r>
-          <w:rPr>
-            <w:rFonts w:ascii="游明朝" w:eastAsia="游明朝" w:hAnsi="游明朝" w:hint="eastAsia"/>
-            <w:szCs w:val="21"/>
-          </w:rPr>
-          <w:t>応用</w:t>
-        </w:r>
-      </w:ins>
+      <w:r>
+        <w:rPr>
+          <w:rFonts w:ascii="游明朝" w:eastAsia="游明朝" w:hAnsi="游明朝" w:hint="eastAsia"/>
+          <w:szCs w:val="21"/>
+        </w:rPr>
+        <w:t>応用</w:t>
+      </w:r>
       <w:r>
         <w:rPr>
           <w:rFonts w:ascii="游明朝" w:eastAsia="游明朝" w:hAnsi="游明朝" w:hint="eastAsia"/>
@@ -2145,15 +1990,13 @@
         </w:rPr>
         <w:t>）</w:t>
       </w:r>
-      <w:ins w:id="27" w:author="作成者">
-        <w:r>
-          <w:rPr>
-            <w:rFonts w:ascii="游明朝" w:eastAsia="游明朝" w:hAnsi="游明朝" w:hint="eastAsia"/>
-            <w:szCs w:val="21"/>
-          </w:rPr>
-          <w:t>基礎コース（</w:t>
-        </w:r>
-      </w:ins>
+      <w:r>
+        <w:rPr>
+          <w:rFonts w:ascii="游明朝" w:eastAsia="游明朝" w:hAnsi="游明朝" w:hint="eastAsia"/>
+          <w:szCs w:val="21"/>
+        </w:rPr>
+        <w:t>基礎コース（</w:t>
+      </w:r>
       <w:r>
         <w:rPr>
           <w:rFonts w:ascii="游明朝" w:eastAsia="游明朝" w:hAnsi="游明朝" w:hint="eastAsia"/>
@@ -2161,15 +2004,13 @@
         </w:rPr>
         <w:t>コンソーシアム参画大学の修士1年生</w:t>
       </w:r>
-      <w:ins w:id="28" w:author="作成者">
-        <w:r>
-          <w:rPr>
-            <w:rFonts w:ascii="游明朝" w:eastAsia="游明朝" w:hAnsi="游明朝" w:hint="eastAsia"/>
-            <w:szCs w:val="21"/>
-          </w:rPr>
-          <w:t>）</w:t>
-        </w:r>
-      </w:ins>
+      <w:r>
+        <w:rPr>
+          <w:rFonts w:ascii="游明朝" w:eastAsia="游明朝" w:hAnsi="游明朝" w:hint="eastAsia"/>
+          <w:szCs w:val="21"/>
+        </w:rPr>
+        <w:t>）</w:t>
+      </w:r>
       <w:r>
         <w:rPr>
           <w:rFonts w:ascii="游明朝" w:eastAsia="游明朝" w:hAnsi="游明朝" w:hint="eastAsia"/>
@@ -2258,15 +2099,13 @@
         </w:rPr>
         <w:t>）</w:t>
       </w:r>
-      <w:ins w:id="29" w:author="作成者">
-        <w:r>
-          <w:rPr>
-            <w:rFonts w:ascii="游明朝" w:eastAsia="游明朝" w:hAnsi="游明朝" w:hint="eastAsia"/>
-            <w:szCs w:val="21"/>
-          </w:rPr>
-          <w:t>応用コース（</w:t>
-        </w:r>
-      </w:ins>
+      <w:r>
+        <w:rPr>
+          <w:rFonts w:ascii="游明朝" w:eastAsia="游明朝" w:hAnsi="游明朝" w:hint="eastAsia"/>
+          <w:szCs w:val="21"/>
+        </w:rPr>
+        <w:t>応用コース（</w:t>
+      </w:r>
       <w:r>
         <w:rPr>
           <w:rFonts w:ascii="游明朝" w:eastAsia="游明朝" w:hAnsi="游明朝" w:hint="eastAsia"/>
@@ -2288,15 +2127,13 @@
         </w:rPr>
         <w:t>コース修了生</w:t>
       </w:r>
-      <w:ins w:id="30" w:author="作成者">
-        <w:r>
-          <w:rPr>
-            <w:rFonts w:ascii="游明朝" w:eastAsia="游明朝" w:hAnsi="游明朝" w:hint="eastAsia"/>
-            <w:szCs w:val="21"/>
-          </w:rPr>
-          <w:t>）</w:t>
-        </w:r>
-      </w:ins>
+      <w:r>
+        <w:rPr>
+          <w:rFonts w:ascii="游明朝" w:eastAsia="游明朝" w:hAnsi="游明朝" w:hint="eastAsia"/>
+          <w:szCs w:val="21"/>
+        </w:rPr>
+        <w:t>）</w:t>
+      </w:r>
     </w:p>
     <w:p>
       <w:pPr>
@@ -2516,8 +2353,8 @@
           <w:lang w:eastAsia="zh-TW"/>
         </w:rPr>
       </w:pPr>
-      <w:bookmarkStart w:id="31" w:name="_Hlk84846797"/>
-      <w:bookmarkStart w:id="32" w:name="_Hlk117068690"/>
+      <w:bookmarkStart w:id="1" w:name="_Hlk84846797"/>
+      <w:bookmarkStart w:id="2" w:name="_Hlk117068690"/>
       <w:r>
         <w:rPr>
           <w:rFonts w:ascii="游明朝" w:eastAsia="游明朝" w:hAnsi="游明朝" w:hint="eastAsia"/>
@@ -2716,7 +2553,6 @@
           <w:rFonts w:ascii="游明朝" w:eastAsia="游明朝" w:hAnsi="游明朝"/>
           <w:szCs w:val="21"/>
         </w:rPr>
-        <w:lastRenderedPageBreak/>
         <w:tab/>
       </w:r>
       <w:r>
@@ -2765,6 +2601,7 @@
           <w:szCs w:val="21"/>
           <w:lang w:eastAsia="zh-CN"/>
         </w:rPr>
+        <w:lastRenderedPageBreak/>
         <w:t>東北大学理学研究科</w:t>
       </w:r>
       <w:r>
@@ -3735,7 +3572,7 @@
           <w:szCs w:val="21"/>
         </w:rPr>
       </w:pPr>
-      <w:bookmarkStart w:id="33" w:name="_Hlk84947036"/>
+      <w:bookmarkStart w:id="3" w:name="_Hlk84947036"/>
       <w:r>
         <w:rPr>
           <w:rFonts w:ascii="游明朝" w:eastAsia="游明朝" w:hAnsi="游明朝" w:hint="eastAsia"/>
@@ -4000,7 +3837,7 @@
           <w:szCs w:val="21"/>
         </w:rPr>
       </w:pPr>
-      <w:bookmarkStart w:id="34" w:name="_Hlk178944599"/>
+      <w:bookmarkStart w:id="4" w:name="_Hlk178944599"/>
       <w:r>
         <w:rPr>
           <w:rFonts w:ascii="游明朝" w:eastAsia="游明朝" w:hAnsi="游明朝"/>
@@ -4030,8 +3867,8 @@
         <w:t>geshi.nobuo.874@m.kyushu-u.ac.jp</w:t>
       </w:r>
     </w:p>
-    <w:bookmarkEnd w:id="33"/>
-    <w:bookmarkEnd w:id="34"/>
+    <w:bookmarkEnd w:id="3"/>
+    <w:bookmarkEnd w:id="4"/>
     <w:p>
       <w:pPr>
         <w:tabs>
@@ -4086,7 +3923,7 @@
         <w:t>k8752657_at_sci.kagoshima-u.ac.jp</w:t>
       </w:r>
     </w:p>
-    <w:bookmarkEnd w:id="31"/>
+    <w:bookmarkEnd w:id="1"/>
     <w:p>
       <w:pPr>
         <w:tabs>
@@ -4134,7 +3971,7 @@
         <w:t>注）_at_は@に変えてください。</w:t>
       </w:r>
     </w:p>
-    <w:bookmarkEnd w:id="32"/>
+    <w:bookmarkEnd w:id="2"/>
     <w:p>
       <w:pPr>
         <w:autoSpaceDE w:val="0"/>
@@ -4296,13 +4133,12 @@
           <w:szCs w:val="21"/>
         </w:rPr>
       </w:pPr>
-      <w:bookmarkStart w:id="35" w:name="_Hlk86665962"/>
-      <w:r>
-        <w:rPr>
-          <w:rFonts w:ascii="游明朝" w:eastAsia="游明朝" w:hAnsi="游明朝" w:hint="eastAsia"/>
-          <w:szCs w:val="21"/>
-        </w:rPr>
-        <w:lastRenderedPageBreak/>
+      <w:bookmarkStart w:id="5" w:name="_Hlk86665962"/>
+      <w:r>
+        <w:rPr>
+          <w:rFonts w:ascii="游明朝" w:eastAsia="游明朝" w:hAnsi="游明朝" w:hint="eastAsia"/>
+          <w:szCs w:val="21"/>
+        </w:rPr>
         <w:t>詳しくは、</w:t>
       </w:r>
       <w:r>
@@ -4320,7 +4156,7 @@
         <w:tab/>
       </w:r>
     </w:p>
-    <w:bookmarkEnd w:id="35"/>
+    <w:bookmarkEnd w:id="5"/>
     <w:p>
       <w:pPr>
         <w:tabs>
@@ -4459,7 +4295,15 @@
           <w:rFonts w:ascii="游明朝" w:eastAsia="游明朝" w:hAnsi="游明朝" w:hint="eastAsia"/>
           <w:szCs w:val="21"/>
         </w:rPr>
-        <w:t>、東京都立大学、早稲田大学、信州大学、富山大学、</w:t>
+        <w:t>、</w:t>
+      </w:r>
+      <w:r>
+        <w:rPr>
+          <w:rFonts w:ascii="游明朝" w:eastAsia="游明朝" w:hAnsi="游明朝" w:hint="eastAsia"/>
+          <w:szCs w:val="21"/>
+        </w:rPr>
+        <w:lastRenderedPageBreak/>
+        <w:t>東京都立大学、早稲田大学、信州大学、富山大学、</w:t>
       </w:r>
       <w:r>
         <w:rPr>

</xml_diff>

<commit_message>
Update course application downloads
</commit_message>
<xml_diff>
--- a/downloads/資料5_募集要項（基礎コース）（案）修正案.docx
+++ b/downloads/資料5_募集要項（基礎コース）（案）修正案.docx
@@ -1391,133 +1391,6 @@
           <w:bCs/>
           <w:szCs w:val="21"/>
         </w:rPr>
-        <w:t xml:space="preserve"> https://www.kazan-edu.jp/students.php よりダウンロードし、必要事項を記入の上、pdfとしてメールで提出してください。</w:t>
-      </w:r>
-    </w:p>
-    <w:p>
-      <w:pPr>
-        <w:pStyle w:val="a3"/>
-        <w:ind w:leftChars="0" w:left="450"/>
-        <w:rPr>
-          <w:rFonts w:ascii="游明朝" w:eastAsia="游明朝" w:hAnsi="游明朝"/>
-          <w:bCs/>
-          <w:szCs w:val="21"/>
-        </w:rPr>
-      </w:pPr>
-      <w:r>
-        <w:rPr>
-          <w:rFonts w:ascii="游明朝" w:eastAsia="游明朝" w:hAnsi="游明朝" w:hint="eastAsia"/>
-          <w:bCs/>
-          <w:szCs w:val="21"/>
-        </w:rPr>
-        <w:t>（1）</w:t>
-      </w:r>
-      <w:r>
-        <w:rPr>
-          <w:rFonts w:ascii="游明朝" w:eastAsia="游明朝" w:hAnsi="游明朝" w:hint="eastAsia"/>
-          <w:bCs/>
-          <w:szCs w:val="21"/>
-        </w:rPr>
-        <w:t>基礎コース（</w:t>
-      </w:r>
-      <w:r>
-        <w:rPr>
-          <w:rFonts w:ascii="游明朝" w:eastAsia="游明朝" w:hAnsi="游明朝" w:hint="eastAsia"/>
-          <w:bCs/>
-          <w:szCs w:val="21"/>
-        </w:rPr>
-        <w:t>コンソーシアムに参画する大学</w:t>
-      </w:r>
-      <w:r>
-        <w:rPr>
-          <w:rFonts w:ascii="游明朝" w:eastAsia="游明朝" w:hAnsi="游明朝" w:hint="eastAsia"/>
-          <w:bCs/>
-          <w:szCs w:val="21"/>
-        </w:rPr>
-        <w:t>の修士1年生</w:t>
-      </w:r>
-      <w:r>
-        <w:rPr>
-          <w:rFonts w:ascii="游明朝" w:eastAsia="游明朝" w:hAnsi="游明朝" w:hint="eastAsia"/>
-          <w:bCs/>
-          <w:szCs w:val="21"/>
-        </w:rPr>
-        <w:t>）</w:t>
-      </w:r>
-    </w:p>
-    <w:p>
-      <w:pPr>
-        <w:ind w:leftChars="406" w:left="1134" w:hangingChars="134" w:hanging="281"/>
-        <w:jc w:val="left"/>
-        <w:rPr>
-          <w:rFonts w:ascii="游明朝" w:eastAsia="游明朝" w:hAnsi="游明朝"/>
-          <w:szCs w:val="21"/>
-        </w:rPr>
-      </w:pPr>
-      <w:r>
-        <w:rPr>
-          <w:rFonts w:ascii="游明朝" w:eastAsia="游明朝" w:hAnsi="游明朝" w:hint="eastAsia"/>
-          <w:szCs w:val="21"/>
-        </w:rPr>
-        <w:t>１．</w:t>
-      </w:r>
-      <w:r>
-        <w:rPr>
-          <w:rFonts w:ascii="游明朝" w:eastAsia="游明朝" w:hAnsi="游明朝" w:hint="eastAsia"/>
-          <w:szCs w:val="21"/>
-        </w:rPr>
-        <w:t>火山</w:t>
-      </w:r>
-      <w:r>
-        <w:rPr>
-          <w:rFonts w:ascii="游明朝" w:eastAsia="游明朝" w:hAnsi="游明朝" w:hint="eastAsia"/>
-          <w:szCs w:val="21"/>
-        </w:rPr>
-        <w:t>ハザード対策</w:t>
-      </w:r>
-      <w:r>
-        <w:rPr>
-          <w:rFonts w:ascii="游明朝" w:eastAsia="游明朝" w:hAnsi="游明朝" w:hint="eastAsia"/>
-          <w:szCs w:val="21"/>
-        </w:rPr>
-        <w:t>研究</w:t>
-      </w:r>
-      <w:r>
-        <w:rPr>
-          <w:rFonts w:ascii="游明朝" w:eastAsia="游明朝" w:hAnsi="游明朝" w:hint="eastAsia"/>
-          <w:szCs w:val="21"/>
-        </w:rPr>
-        <w:t>人材</w:t>
-      </w:r>
-      <w:r>
-        <w:rPr>
-          <w:rFonts w:ascii="游明朝" w:eastAsia="游明朝" w:hAnsi="游明朝" w:hint="eastAsia"/>
-          <w:szCs w:val="21"/>
-        </w:rPr>
-        <w:t>育成プログラム調査票</w:t>
-      </w:r>
-    </w:p>
-    <w:p>
-      <w:pPr>
-        <w:ind w:leftChars="675" w:left="1418"/>
-        <w:jc w:val="left"/>
-        <w:rPr>
-          <w:rFonts w:ascii="游明朝" w:eastAsia="游明朝" w:hAnsi="游明朝"/>
-          <w:szCs w:val="21"/>
-        </w:rPr>
-      </w:pPr>
-      <w:r>
-        <w:rPr>
-          <w:rFonts w:ascii="游明朝" w:eastAsia="游明朝" w:hAnsi="游明朝" w:hint="eastAsia"/>
-          <w:szCs w:val="21"/>
-        </w:rPr>
-        <w:t>本プログラムのホームページ</w:t>
-      </w:r>
-      <w:r>
-        <w:rPr>
-          <w:rFonts w:ascii="游明朝" w:eastAsia="游明朝" w:hAnsi="游明朝" w:hint="eastAsia"/>
-          <w:szCs w:val="21"/>
-        </w:rPr>
         <w:t xml:space="preserve"> </w:t>
       </w:r>
       <w:hyperlink r:id="rId7" w:history="1">
@@ -1531,84 +1404,118 @@
         </w:r>
       </w:hyperlink>
       <w:r>
-        <w:rPr>
-          <w:rStyle w:val="aa"/>
-          <w:rFonts w:ascii="游明朝" w:eastAsia="游明朝" w:hAnsi="游明朝"/>
-          <w:color w:val="auto"/>
-          <w:szCs w:val="21"/>
-          <w:u w:val="none"/>
-        </w:rPr>
         <w:t xml:space="preserve"> </w:t>
       </w:r>
       <w:r>
         <w:rPr>
-          <w:rFonts w:ascii="游明朝" w:eastAsia="游明朝" w:hAnsi="游明朝" w:hint="eastAsia"/>
-          <w:szCs w:val="21"/>
-        </w:rPr>
-        <w:t>より</w:t>
-      </w:r>
-      <w:r>
-        <w:rPr>
-          <w:rFonts w:ascii="游明朝" w:eastAsia="游明朝" w:hAnsi="游明朝" w:hint="eastAsia"/>
-          <w:szCs w:val="21"/>
-        </w:rPr>
-        <w:t>調査票</w:t>
-      </w:r>
-      <w:r>
-        <w:rPr>
-          <w:rFonts w:ascii="游明朝" w:eastAsia="游明朝" w:hAnsi="游明朝" w:hint="eastAsia"/>
-          <w:szCs w:val="21"/>
-        </w:rPr>
-        <w:t>をダウンロードし、必要事項を記入の上、</w:t>
-      </w:r>
-      <w:r>
-        <w:rPr>
-          <w:rFonts w:ascii="游明朝" w:eastAsia="游明朝" w:hAnsi="游明朝"/>
-          <w:szCs w:val="21"/>
-        </w:rPr>
-        <w:t>pdfとして</w:t>
-      </w:r>
-      <w:r>
-        <w:rPr>
-          <w:rFonts w:ascii="游明朝" w:eastAsia="游明朝" w:hAnsi="游明朝" w:hint="eastAsia"/>
-          <w:szCs w:val="21"/>
-        </w:rPr>
-        <w:t>メールで</w:t>
-      </w:r>
-      <w:r>
-        <w:rPr>
-          <w:rFonts w:ascii="游明朝" w:eastAsia="游明朝" w:hAnsi="游明朝"/>
-          <w:szCs w:val="21"/>
-        </w:rPr>
-        <w:t>提出</w:t>
-      </w:r>
-      <w:r>
-        <w:rPr>
-          <w:rFonts w:ascii="游明朝" w:eastAsia="游明朝" w:hAnsi="游明朝" w:hint="eastAsia"/>
-          <w:szCs w:val="21"/>
-        </w:rPr>
-        <w:t>してください</w:t>
-      </w:r>
-      <w:r>
-        <w:rPr>
-          <w:rFonts w:ascii="游明朝" w:eastAsia="游明朝" w:hAnsi="游明朝"/>
-          <w:szCs w:val="21"/>
-        </w:rPr>
-        <w:t>。</w:t>
+          <w:rFonts w:ascii="游明朝" w:eastAsia="游明朝" w:hAnsi="游明朝"/>
+          <w:bCs/>
+          <w:szCs w:val="21"/>
+        </w:rPr>
+        <w:t>よりダウンロードし、必要事項を記入の上、pdfとしてメールで提出してください。</w:t>
+      </w:r>
+    </w:p>
+    <w:p>
+      <w:pPr>
+        <w:pStyle w:val="a3"/>
+        <w:ind w:leftChars="0" w:left="450"/>
+        <w:rPr>
+          <w:rFonts w:ascii="游明朝" w:eastAsia="游明朝" w:hAnsi="游明朝"/>
+          <w:bCs/>
+          <w:szCs w:val="21"/>
+        </w:rPr>
+      </w:pPr>
+      <w:r>
+        <w:rPr>
+          <w:rFonts w:ascii="游明朝" w:eastAsia="游明朝" w:hAnsi="游明朝" w:hint="eastAsia"/>
+          <w:bCs/>
+          <w:szCs w:val="21"/>
+        </w:rPr>
+        <w:t>（1）</w:t>
+      </w:r>
+      <w:r>
+        <w:rPr>
+          <w:rFonts w:ascii="游明朝" w:eastAsia="游明朝" w:hAnsi="游明朝" w:hint="eastAsia"/>
+          <w:bCs/>
+          <w:szCs w:val="21"/>
+        </w:rPr>
+        <w:t>基礎コース（</w:t>
+      </w:r>
+      <w:r>
+        <w:rPr>
+          <w:rFonts w:ascii="游明朝" w:eastAsia="游明朝" w:hAnsi="游明朝" w:hint="eastAsia"/>
+          <w:bCs/>
+          <w:szCs w:val="21"/>
+        </w:rPr>
+        <w:t>コンソーシアムに参画する大学</w:t>
+      </w:r>
+      <w:r>
+        <w:rPr>
+          <w:rFonts w:ascii="游明朝" w:eastAsia="游明朝" w:hAnsi="游明朝" w:hint="eastAsia"/>
+          <w:bCs/>
+          <w:szCs w:val="21"/>
+        </w:rPr>
+        <w:t>の修士1年生</w:t>
+      </w:r>
+      <w:r>
+        <w:rPr>
+          <w:rFonts w:ascii="游明朝" w:eastAsia="游明朝" w:hAnsi="游明朝" w:hint="eastAsia"/>
+          <w:bCs/>
+          <w:szCs w:val="21"/>
+        </w:rPr>
+        <w:t>）</w:t>
       </w:r>
     </w:p>
     <w:p>
       <w:pPr>
         <w:ind w:leftChars="406" w:left="1134" w:hangingChars="134" w:hanging="281"/>
-        <w:rPr>
-          <w:rFonts w:ascii="游明朝" w:eastAsia="游明朝" w:hAnsi="游明朝"/>
-        </w:rPr>
-      </w:pPr>
-      <w:r>
-        <w:rPr>
-          <w:rFonts w:ascii="游明朝" w:eastAsia="游明朝" w:hAnsi="游明朝" w:hint="eastAsia"/>
-        </w:rPr>
-        <w:t>２．応募者の成績証明書</w:t>
+        <w:jc w:val="left"/>
+        <w:rPr>
+          <w:rFonts w:ascii="游明朝" w:eastAsia="游明朝" w:hAnsi="游明朝"/>
+          <w:szCs w:val="21"/>
+        </w:rPr>
+      </w:pPr>
+      <w:r>
+        <w:rPr>
+          <w:rFonts w:ascii="游明朝" w:eastAsia="游明朝" w:hAnsi="游明朝" w:hint="eastAsia"/>
+          <w:szCs w:val="21"/>
+        </w:rPr>
+        <w:t>１．</w:t>
+      </w:r>
+      <w:r>
+        <w:rPr>
+          <w:rFonts w:ascii="游明朝" w:eastAsia="游明朝" w:hAnsi="游明朝" w:hint="eastAsia"/>
+          <w:szCs w:val="21"/>
+        </w:rPr>
+        <w:t>火山</w:t>
+      </w:r>
+      <w:r>
+        <w:rPr>
+          <w:rFonts w:ascii="游明朝" w:eastAsia="游明朝" w:hAnsi="游明朝" w:hint="eastAsia"/>
+          <w:szCs w:val="21"/>
+        </w:rPr>
+        <w:t>ハザード対策</w:t>
+      </w:r>
+      <w:r>
+        <w:rPr>
+          <w:rFonts w:ascii="游明朝" w:eastAsia="游明朝" w:hAnsi="游明朝" w:hint="eastAsia"/>
+          <w:szCs w:val="21"/>
+        </w:rPr>
+        <w:t>研究</w:t>
+      </w:r>
+      <w:r>
+        <w:rPr>
+          <w:rFonts w:ascii="游明朝" w:eastAsia="游明朝" w:hAnsi="游明朝" w:hint="eastAsia"/>
+          <w:szCs w:val="21"/>
+        </w:rPr>
+        <w:t>人材</w:t>
+      </w:r>
+      <w:r>
+        <w:rPr>
+          <w:rFonts w:ascii="游明朝" w:eastAsia="游明朝" w:hAnsi="游明朝" w:hint="eastAsia"/>
+          <w:szCs w:val="21"/>
+        </w:rPr>
+        <w:t>育成プログラム調査票</w:t>
       </w:r>
     </w:p>
     <w:p>
@@ -1617,6 +1524,120 @@
         <w:jc w:val="left"/>
         <w:rPr>
           <w:rFonts w:ascii="游明朝" w:eastAsia="游明朝" w:hAnsi="游明朝"/>
+          <w:szCs w:val="21"/>
+        </w:rPr>
+      </w:pPr>
+      <w:r>
+        <w:rPr>
+          <w:rFonts w:ascii="游明朝" w:eastAsia="游明朝" w:hAnsi="游明朝" w:hint="eastAsia"/>
+          <w:szCs w:val="21"/>
+        </w:rPr>
+        <w:t>本プログラムのホームページ</w:t>
+      </w:r>
+      <w:r>
+        <w:rPr>
+          <w:rFonts w:ascii="游明朝" w:eastAsia="游明朝" w:hAnsi="游明朝" w:hint="eastAsia"/>
+          <w:szCs w:val="21"/>
+        </w:rPr>
+        <w:t xml:space="preserve"> </w:t>
+      </w:r>
+      <w:hyperlink r:id="rId8" w:history="1">
+        <w:r>
+          <w:rPr>
+            <w:rStyle w:val="aa"/>
+            <w:rFonts w:ascii="游明朝" w:eastAsia="游明朝" w:hAnsi="游明朝"/>
+            <w:szCs w:val="21"/>
+          </w:rPr>
+          <w:t>https://vlead-edu.github.io/vlead-edu/</w:t>
+        </w:r>
+      </w:hyperlink>
+      <w:r>
+        <w:rPr>
+          <w:rStyle w:val="aa"/>
+          <w:rFonts w:ascii="游明朝" w:eastAsia="游明朝" w:hAnsi="游明朝"/>
+          <w:color w:val="auto"/>
+          <w:szCs w:val="21"/>
+          <w:u w:val="none"/>
+        </w:rPr>
+        <w:t xml:space="preserve"> </w:t>
+      </w:r>
+      <w:r>
+        <w:rPr>
+          <w:rFonts w:ascii="游明朝" w:eastAsia="游明朝" w:hAnsi="游明朝" w:hint="eastAsia"/>
+          <w:szCs w:val="21"/>
+        </w:rPr>
+        <w:t>より</w:t>
+      </w:r>
+      <w:r>
+        <w:rPr>
+          <w:rFonts w:ascii="游明朝" w:eastAsia="游明朝" w:hAnsi="游明朝" w:hint="eastAsia"/>
+          <w:szCs w:val="21"/>
+        </w:rPr>
+        <w:t>調査票</w:t>
+      </w:r>
+      <w:r>
+        <w:rPr>
+          <w:rFonts w:ascii="游明朝" w:eastAsia="游明朝" w:hAnsi="游明朝" w:hint="eastAsia"/>
+          <w:szCs w:val="21"/>
+        </w:rPr>
+        <w:t>をダウンロードし、必要事項を記入の上、</w:t>
+      </w:r>
+      <w:r>
+        <w:rPr>
+          <w:rFonts w:ascii="游明朝" w:eastAsia="游明朝" w:hAnsi="游明朝"/>
+          <w:szCs w:val="21"/>
+        </w:rPr>
+        <w:t>pdfとして</w:t>
+      </w:r>
+      <w:r>
+        <w:rPr>
+          <w:rFonts w:ascii="游明朝" w:eastAsia="游明朝" w:hAnsi="游明朝" w:hint="eastAsia"/>
+          <w:szCs w:val="21"/>
+        </w:rPr>
+        <w:t>メールで</w:t>
+      </w:r>
+      <w:r>
+        <w:rPr>
+          <w:rFonts w:ascii="游明朝" w:eastAsia="游明朝" w:hAnsi="游明朝"/>
+          <w:szCs w:val="21"/>
+        </w:rPr>
+        <w:t>提出</w:t>
+      </w:r>
+      <w:r>
+        <w:rPr>
+          <w:rFonts w:ascii="游明朝" w:eastAsia="游明朝" w:hAnsi="游明朝" w:hint="eastAsia"/>
+          <w:szCs w:val="21"/>
+        </w:rPr>
+        <w:t>してください</w:t>
+      </w:r>
+      <w:r>
+        <w:rPr>
+          <w:rFonts w:ascii="游明朝" w:eastAsia="游明朝" w:hAnsi="游明朝"/>
+          <w:szCs w:val="21"/>
+        </w:rPr>
+        <w:t>。</w:t>
+      </w:r>
+    </w:p>
+    <w:p>
+      <w:pPr>
+        <w:ind w:leftChars="406" w:left="1134" w:hangingChars="134" w:hanging="281"/>
+        <w:rPr>
+          <w:rFonts w:ascii="游明朝" w:eastAsia="游明朝" w:hAnsi="游明朝"/>
+        </w:rPr>
+      </w:pPr>
+      <w:r>
+        <w:rPr>
+          <w:rFonts w:ascii="游明朝" w:eastAsia="游明朝" w:hAnsi="游明朝" w:hint="eastAsia"/>
+        </w:rPr>
+        <w:t>２．応募者の成績証明書</w:t>
+      </w:r>
+    </w:p>
+    <w:p>
+      <w:pPr>
+        <w:ind w:leftChars="675" w:left="1418"/>
+        <w:jc w:val="left"/>
+        <w:rPr>
+          <w:rFonts w:ascii="游明朝" w:eastAsia="游明朝" w:hAnsi="游明朝"/>
         </w:rPr>
       </w:pPr>
       <w:r>
@@ -1822,7 +1843,7 @@
         </w:rPr>
         <w:t xml:space="preserve"> </w:t>
       </w:r>
-      <w:hyperlink r:id="rId8" w:history="1">
+      <w:hyperlink r:id="rId9" w:history="1">
         <w:r>
           <w:rPr>
             <w:rStyle w:val="aa"/>

</xml_diff>